<commit_message>
new outcome added to meeting minutes
</commit_message>
<xml_diff>
--- a/minute/MeetingMinutes_1.docx
+++ b/minute/MeetingMinutes_1.docx
@@ -230,7 +230,17 @@
         <w:spacing w:line="240" w:lineRule="auto"/>
         <w:contextualSpacing/>
         <w:rPr>
-          <w:rFonts w:hint="eastAsia"/>
+          <w:b/>
+        </w:rPr>
+      </w:pPr>
+    </w:p>
+    <w:p>
+      <w:pPr>
+        <w:spacing w:line="240" w:lineRule="auto"/>
+        <w:contextualSpacing/>
+        <w:rPr>
+          <w:rFonts w:hint="default"/>
+          <w:lang w:val="en-US"/>
         </w:rPr>
       </w:pPr>
       <w:r>
@@ -256,40 +266,26 @@
           <w:lang w:val="en-US"/>
         </w:rPr>
       </w:pPr>
-    </w:p>
-    <w:p>
-      <w:pPr>
-        <w:spacing w:line="240" w:lineRule="auto"/>
-        <w:contextualSpacing/>
-        <w:rPr>
-          <w:rFonts w:hint="default"/>
-          <w:lang w:val="en-US"/>
-        </w:rPr>
-      </w:pPr>
-      <w:r>
-        <w:rPr>
-          <w:rFonts w:hint="default"/>
-          <w:lang w:val="en-US"/>
-        </w:rPr>
-        <w:t>2.Comes up with a list of questions to elicit more details for the project</w:t>
-      </w:r>
-    </w:p>
-    <w:p>
-      <w:pPr>
-        <w:spacing w:line="240" w:lineRule="auto"/>
-        <w:ind w:firstLine="420" w:firstLineChars="0"/>
-        <w:contextualSpacing/>
-        <w:rPr>
-          <w:rFonts w:hint="default"/>
-          <w:lang w:val="en-US"/>
-        </w:rPr>
-      </w:pPr>
-      <w:r>
-        <w:rPr>
-          <w:rFonts w:hint="default"/>
-          <w:lang w:val="en-US"/>
-        </w:rPr>
-        <w:t>Prepares one list of questions about the project</w:t>
+      <w:r>
+        <w:rPr>
+          <w:rFonts w:hint="default"/>
+          <w:lang w:val="en-US"/>
+        </w:rPr>
+        <w:t xml:space="preserve">2.Comes up with </w:t>
+      </w:r>
+      <w:r>
+        <w:rPr>
+          <w:rFonts w:hint="eastAsia"/>
+          <w:lang w:val="en-US" w:eastAsia="zh-CN"/>
+        </w:rPr>
+        <w:t>2</w:t>
+      </w:r>
+      <w:r>
+        <w:rPr>
+          <w:rFonts w:hint="default"/>
+          <w:lang w:val="en-US"/>
+        </w:rPr>
+        <w:t xml:space="preserve"> list of questions to elicit more details for the project</w:t>
       </w:r>
     </w:p>
     <w:p>
@@ -300,10 +296,19 @@
           <w:b/>
         </w:rPr>
       </w:pPr>
-      <w:r>
+    </w:p>
+    <w:p>
+      <w:pPr>
+        <w:spacing w:line="240" w:lineRule="auto"/>
+        <w:contextualSpacing/>
         <w:rPr>
           <w:b/>
         </w:rPr>
+      </w:pPr>
+      <w:r>
+        <w:rPr>
+          <w:b/>
+        </w:rPr>
         <w:t>Announcements:</w:t>
       </w:r>
     </w:p>
@@ -333,15 +338,36 @@
         <w:spacing w:line="240" w:lineRule="auto"/>
         <w:contextualSpacing/>
         <w:rPr>
-          <w:rFonts w:hint="default"/>
-          <w:lang w:val="en-US"/>
-        </w:rPr>
-      </w:pPr>
-      <w:r>
-        <w:rPr>
-          <w:rFonts w:hint="eastAsia"/>
-        </w:rPr>
-        <w:t>leader</w:t>
+          <w:b/>
+        </w:rPr>
+      </w:pPr>
+    </w:p>
+    <w:p>
+      <w:pPr>
+        <w:numPr>
+          <w:ilvl w:val="0"/>
+          <w:numId w:val="1"/>
+        </w:numPr>
+        <w:spacing w:line="240" w:lineRule="auto"/>
+        <w:ind w:left="425" w:leftChars="0" w:hanging="425" w:firstLineChars="0"/>
+        <w:contextualSpacing/>
+        <w:rPr>
+          <w:rFonts w:hint="default"/>
+          <w:lang w:val="en-US"/>
+        </w:rPr>
+      </w:pPr>
+      <w:r>
+        <w:rPr>
+          <w:rFonts w:hint="eastAsia"/>
+          <w:lang w:val="en-US" w:eastAsia="zh-CN"/>
+        </w:rPr>
+        <w:t>L</w:t>
+      </w:r>
+      <w:r>
+        <w:rPr>
+          <w:rFonts w:hint="eastAsia"/>
+        </w:rPr>
+        <w:t>eader</w:t>
       </w:r>
       <w:r>
         <w:rPr>
@@ -374,22 +400,79 @@
           <w:rFonts w:hint="eastAsia"/>
           <w:lang w:val="en-US" w:eastAsia="zh-CN"/>
         </w:rPr>
-        <w:t xml:space="preserve">    </w:t>
+        <w:t xml:space="preserve">    S</w:t>
+      </w:r>
+      <w:r>
+        <w:rPr>
+          <w:rFonts w:hint="eastAsia"/>
+        </w:rPr>
+        <w:t>ecretary</w:t>
+      </w:r>
+      <w:r>
+        <w:rPr>
+          <w:rFonts w:hint="default"/>
+          <w:lang w:val="en-US"/>
+        </w:rPr>
+        <w:t>: HOU Shuoran.</w:t>
+      </w:r>
+    </w:p>
+    <w:p>
+      <w:pPr>
+        <w:numPr>
+          <w:ilvl w:val="0"/>
+          <w:numId w:val="1"/>
+        </w:numPr>
+        <w:spacing w:line="240" w:lineRule="auto"/>
+        <w:ind w:left="425" w:leftChars="0" w:hanging="425" w:firstLineChars="0"/>
+        <w:contextualSpacing/>
+        <w:rPr>
+          <w:rFonts w:hint="default"/>
+          <w:lang w:val="en-US"/>
+        </w:rPr>
+      </w:pPr>
+      <w:r>
+        <w:rPr>
+          <w:rFonts w:hint="eastAsia"/>
+          <w:lang w:val="en-US" w:eastAsia="zh-CN"/>
+        </w:rPr>
+        <w:t>Question L</w:t>
+      </w:r>
+      <w:r>
+        <w:rPr>
+          <w:rFonts w:hint="default"/>
+          <w:lang w:val="en-US"/>
+        </w:rPr>
+        <w:t>ist</w:t>
+      </w:r>
+      <w:r>
+        <w:rPr>
+          <w:rFonts w:hint="eastAsia"/>
+          <w:lang w:val="en-US" w:eastAsia="zh-CN"/>
+        </w:rPr>
+        <w:t xml:space="preserve"> 1 </w:t>
+      </w:r>
+      <w:r>
+        <w:rPr>
+          <w:rFonts w:hint="default"/>
+          <w:lang w:val="en-US" w:eastAsia="zh-CN"/>
+        </w:rPr>
+        <w:t>and 2</w:t>
+      </w:r>
+      <w:r>
+        <w:rPr>
+          <w:rFonts w:hint="default"/>
+          <w:lang w:val="en-US"/>
+        </w:rPr>
+        <w:t xml:space="preserve"> were created</w:t>
       </w:r>
       <w:bookmarkStart w:id="0" w:name="_GoBack"/>
       <w:bookmarkEnd w:id="0"/>
       <w:r>
         <w:rPr>
-          <w:rFonts w:hint="eastAsia"/>
-        </w:rPr>
-        <w:t>secretary</w:t>
-      </w:r>
-      <w:r>
-        <w:rPr>
-          <w:rFonts w:hint="default"/>
-          <w:lang w:val="en-US"/>
-        </w:rPr>
-        <w:t>: HOU Shuoran</w:t>
+          <w:rFonts w:hint="default"/>
+          <w:lang w:val="en-US"/>
+        </w:rPr>
+        <w:t xml:space="preserve"> and submitted to iSpace and GitLab by Hou Shuoran.</w:t>
       </w:r>
     </w:p>
     <w:p>
@@ -489,6 +572,31 @@
     </w:p>
   </w:footnote>
 </w:footnotes>
+</file>
+
+<file path=word/numbering.xml><?xml version="1.0" encoding="utf-8"?>
+<w:numbering xmlns:wpc="http://schemas.microsoft.com/office/word/2010/wordprocessingCanvas" xmlns:mc="http://schemas.openxmlformats.org/markup-compatibility/2006" xmlns:o="urn:schemas-microsoft-com:office:office" xmlns:r="http://schemas.openxmlformats.org/officeDocument/2006/relationships" xmlns:m="http://schemas.openxmlformats.org/officeDocument/2006/math" xmlns:v="urn:schemas-microsoft-com:vml" xmlns:wp14="http://schemas.microsoft.com/office/word/2010/wordprocessingDrawing" xmlns:wp="http://schemas.openxmlformats.org/drawingml/2006/wordprocessingDrawing" xmlns:w10="urn:schemas-microsoft-com:office:word" xmlns:w="http://schemas.openxmlformats.org/wordprocessingml/2006/main" xmlns:w14="http://schemas.microsoft.com/office/word/2010/wordml" xmlns:wpg="http://schemas.microsoft.com/office/word/2010/wordprocessingGroup" xmlns:wpi="http://schemas.microsoft.com/office/word/2010/wordprocessingInk" xmlns:wne="http://schemas.microsoft.com/office/word/2006/wordml" xmlns:wps="http://schemas.microsoft.com/office/word/2010/wordprocessingShape" xmlns:wpsCustomData="http://www.wps.cn/officeDocument/2013/wpsCustomData" mc:Ignorable="w14 wp14">
+  <w:abstractNum w:abstractNumId="0">
+    <w:nsid w:val="9BB2CC62"/>
+    <w:multiLevelType w:val="singleLevel"/>
+    <w:tmpl w:val="9BB2CC62"/>
+    <w:lvl w:ilvl="0" w:tentative="0">
+      <w:start w:val="1"/>
+      <w:numFmt w:val="decimal"/>
+      <w:lvlText w:val="%1."/>
+      <w:lvlJc w:val="left"/>
+      <w:pPr>
+        <w:ind w:left="425" w:hanging="425"/>
+      </w:pPr>
+      <w:rPr>
+        <w:rFonts w:hint="default"/>
+      </w:rPr>
+    </w:lvl>
+  </w:abstractNum>
+  <w:num w:numId="1">
+    <w:abstractNumId w:val="0"/>
+  </w:num>
+</w:numbering>
 </file>
 
 <file path=word/styles.xml><?xml version="1.0" encoding="utf-8"?>

</xml_diff>